<commit_message>
Update thesis to current system state
Chapter 4: network-graph section now describes the demographic
colour-mode dropdown (tribe/religion/hometown/district/regional
capital); new 4.5 Deployment section (Firebase Hosting +
PythonAnywhere). Chapter 5: replaces the stale claims that no test
suite existed and the Deactivate control was UI-only (57 backend
tests now pass; the control is backed by a real endpoint) with an
honest account of the real-data cleaning the project needed, and
notes the deployment in the conclusion.

Co-Authored-By: Claude Fable 5 <noreply@anthropic.com>
</commit_message>
<xml_diff>
--- a/docs/thesis/Chapters_1-5.docx
+++ b/docs/thesis/Chapters_1-5.docx
@@ -1293,7 +1293,7 @@
           <w:rFonts w:ascii="Times New Roman" w:hAnsi="Times New Roman"/>
           <w:sz w:val="24"/>
         </w:rPr>
-        <w:t>This chapter presents the implementation and testing of the UTAS Social Network Analysis System. It sets out the use-case diagram showing how each category of user interacts with the system, the database schema underlying it, a walkthrough of the system's user interfaces in the order a user would normally move through them, and the reporting tools through which the system's analytical output is generated and downloaded.</w:t>
+        <w:t>This chapter presents the implementation and testing of the UTAS Social Network Analysis System. It sets out the use-case diagram showing how each category of user interacts with the system, the database schema underlying it, a walkthrough of the system's user interfaces in the order a user would normally move through them, the reporting tools through which the system's analytical output is generated and downloaded, and finally how the finished system is deployed and hosted.</w:t>
       </w:r>
     </w:p>
     <w:p>
@@ -1846,7 +1846,7 @@
           <w:rFonts w:ascii="Times New Roman" w:hAnsi="Times New Roman"/>
           <w:sz w:val="24"/>
         </w:rPr>
-        <w:t>The Analysis page presents the system's computed metrics: a card for each of degree, betweenness, closeness, and eigenvector centrality and PageRank, each with a short description, a ranked bar chart, and a CSV export button, alongside cards for bridge nodes and detected communities. Campaign Managers and Administrators additionally see controls here to import new survey data and re-run the analysis. The Network Graph page takes the same underlying data and renders it as an interactive, force-directed graph, with nodes coloured by party or community, sized by PageRank, and filterable by department, year, political affiliation, and community, linked directly from the Analysis page for anyone who wants to see the structure rather than the numbers.</w:t>
+        <w:t>The Analysis page presents the system's computed metrics: a card for each of degree, betweenness, closeness, and eigenvector centrality and PageRank, each with a short description, a ranked bar chart, and a CSV export button, alongside cards for bridge nodes and detected communities. Campaign Managers and Administrators additionally see controls here to import new survey data and re-run the analysis. The Network Graph page takes the same underlying data and renders it as an interactive, force-directed graph, with node size driven by PageRank and node colour selectable from a dropdown: political party, detected community, department, tribe, religion, hometown, district, or regional capital. Any attribute students share can therefore be seen as a visible cluster inside the one campus-wide graph, and the display is further filterable by department, year, political affiliation, and community.</w:t>
       </w:r>
     </w:p>
     <w:p>
@@ -3045,6 +3045,32 @@
       </w:r>
     </w:p>
     <w:p>
+      <w:pPr>
+        <w:spacing w:line="480" w:lineRule="auto" w:before="240"/>
+      </w:pPr>
+      <w:r>
+        <w:rPr>
+          <w:rFonts w:ascii="Times New Roman" w:hAnsi="Times New Roman"/>
+          <w:b/>
+          <w:sz w:val="24"/>
+        </w:rPr>
+        <w:t>4.5 Deployment</w:t>
+      </w:r>
+    </w:p>
+    <w:p>
+      <w:pPr>
+        <w:spacing w:line="480" w:lineRule="auto" w:after="0" w:before="0"/>
+        <w:jc w:val="both"/>
+      </w:pPr>
+      <w:r>
+        <w:rPr>
+          <w:rFonts w:ascii="Times New Roman" w:hAnsi="Times New Roman"/>
+          <w:sz w:val="24"/>
+        </w:rPr>
+        <w:t>The finished system is not limited to a development machine; it is deployed and publicly reachable on the internet. The React frontend is served as a static build through Firebase Hosting, while the Flask backend and its database run on PythonAnywhere, a Python-focused hosting service. The two communicate over HTTPS through the same REST API used in development, with cross-origin requests permitted between the two hosts. Both services were chosen deliberately for their free tiers, so the deployment carries no running cost, an important consideration for a student project that should outlive its assessment period. The practical effect is that the system can be opened and used from any device with a browser, and demonstrated live without any local setup.</w:t>
+      </w:r>
+    </w:p>
+    <w:p>
       <w:r>
         <w:br w:type="page"/>
       </w:r>
@@ -3126,7 +3152,7 @@
           <w:rFonts w:ascii="Times New Roman" w:hAnsi="Times New Roman"/>
           <w:sz w:val="24"/>
         </w:rPr>
-        <w:t>This study set out to build a web-based Social Network Analysis system that models student friendship networks at UTAS and turns that structure into concrete guidance for student political campaign planning. That system now exists: a Flask and Python backend stores the data and uses NetworkX to compute degree, betweenness, closeness, and eigenvector centrality, PageRank, Louvain community detection, and bridge-node identification, while a React and TypeScript frontend presents the results through a dashboard, student and connection management, a per-metric analysis view, an interactive network graph, and a reporting module exporting PDF, CSV, and Excel output.</w:t>
+        <w:t>This study set out to build a web-based Social Network Analysis system that models student friendship networks at UTAS and turns that structure into concrete guidance for student political campaign planning. That system now exists: a Flask and Python backend stores the data and uses NetworkX to compute degree, betweenness, closeness, and eigenvector centrality, PageRank, Louvain community detection, and bridge-node identification, while a React and TypeScript frontend presents the results through a dashboard, student and connection management, a per-metric analysis view, an interactive network graph, and a reporting module exporting PDF, CSV, and Excel output. The system is deployed and publicly accessible, with the frontend on Firebase Hosting and the backend on PythonAnywhere, and its backend is covered by an automated suite of 57 tests.</w:t>
       </w:r>
     </w:p>
     <w:p>
@@ -3204,7 +3230,20 @@
           <w:rFonts w:ascii="Times New Roman" w:hAnsi="Times New Roman"/>
           <w:sz w:val="24"/>
         </w:rPr>
-        <w:t>A handful of smaller items are also left unfinished. The Users page has a Deactivate control that only updates the interface, since no backing endpoint for it exists on the backend yet. The frontend's JavaScript bundle is close to 1.3 megabytes, which would be worth trimming through code-splitting if the system ever needed to scale past a class-sized cohort. The system was also verified throughout by hand, live API calls, TypeScript checks, and manual review, rather than by an automated test suite, so writing one would make future changes to it considerably safer to make. Finally, given how much of this dissertation's sample data turned out to include real students' names and, in places, real email addresses, building a proper anonymisation step into the system, rather than relying on someone remembering to redact it by hand, would be a sensible piece of unfinished work to pick up first.</w:t>
+        <w:t>Working with the real survey data also taught a practical lesson worth passing on: self-reported data needs deliberate cleaning before analysis can be trusted. The same department arrived spelt a dozen different ways across responses, a few answers carried typos or redundant phrasing, and one respondent typed a sentence declining to name a friend into the name field, which the importer initially turned into a phantom student connected to the network. The system now normalises department names automatically on every import and edit, and the remaining one-off corrections were scripted so they can be re-applied to any copy of the database, but future data-collection rounds would benefit from constraining free-text answers in the survey itself, through dropdowns wherever the set of valid answers is known in advance.</w:t>
+      </w:r>
+    </w:p>
+    <w:p>
+      <w:pPr>
+        <w:spacing w:line="480" w:lineRule="auto" w:after="0" w:before="0"/>
+        <w:jc w:val="both"/>
+      </w:pPr>
+      <w:r>
+        <w:rPr>
+          <w:rFonts w:ascii="Times New Roman" w:hAnsi="Times New Roman"/>
+          <w:sz w:val="24"/>
+        </w:rPr>
+        <w:t>A few smaller items remain open. The frontend's JavaScript bundle is close to 1.4 megabytes, which would be worth trimming through code-splitting if the system ever needed to serve a much larger population. The backend is now covered by an automated test suite of 57 tests spanning authentication, student and connection management, campaigns, analysis endpoints, and the survey importer, but the frontend still has no automated tests of its own, relying on TypeScript compilation and manual checks instead. Finally, given how much of this dissertation's sample data turned out to include real students' names and, in places, real email addresses, building a proper anonymisation step into the system, rather than relying on someone remembering to redact it by hand, would be a sensible piece of unfinished work to pick up first.</w:t>
       </w:r>
     </w:p>
     <w:p>

</xml_diff>

<commit_message>
Soften the few remaining stiff phrases in the thesis prose
Co-Authored-By: Claude Fable 5 <noreply@anthropic.com>
</commit_message>
<xml_diff>
--- a/docs/thesis/Chapters_1-5.docx
+++ b/docs/thesis/Chapters_1-5.docx
@@ -410,7 +410,7 @@
           <w:rFonts w:ascii="Times New Roman" w:hAnsi="Times New Roman"/>
           <w:sz w:val="24"/>
         </w:rPr>
-        <w:t>Centrality measures quantify how important a node is within a network. Freeman's (1978) conceptual clarification of centrality is still the reference point most later measures get checked against, and it is what settles the question of what "important" is even supposed to mean here: he distinguished a node that simply has many connections from one that sits on the paths between other nodes, and from one that can reach the rest of the network in the fewest steps, treating these as three genuinely different kinds of prominence rather than three ways of measuring the same thing. Degree centrality counts the number of direct connections a node has, and is the simplest measure of local prominence. Betweenness centrality counts how many shortest paths between other pairs of nodes pass through a given node, which identifies actors who act as brokers or bridges between otherwise separate parts of the network. Closeness centrality measures how few steps, on average, a node needs to reach every other node in the network, which identifies actors who can spread information quickly. Eigenvector centrality extends degree centrality by weighting a node's importance according to the importance of its neighbours, so a connection to an already-influential node counts for more than a connection to a peripheral one. PageRank, which Brin and Page (1998) built to rank web pages by treating a hyperlink as a vote weighted by the importance of the page casting it, applies that same recursive logic and is commonly used in social-network contexts as a robust alternative to eigenvector centrality.</w:t>
+        <w:t>Centrality measures quantify how important a node is within a network. Freeman's (1978) conceptual clarification of centrality is still the reference point most later measures get checked against, and it is what settles the question of what "important" is even supposed to mean here: he distinguished a node that simply has many connections from one that sits on the paths between other nodes, and from one that can reach the rest of the network in the fewest steps, treating these as three genuinely different kinds of prominence rather than three ways of measuring the same thing. Degree centrality counts the number of direct connections a node has, and is the simplest measure of local prominence. Betweenness centrality counts how many shortest paths between other pairs of nodes pass through a given node, which identifies actors who act as brokers or bridges between otherwise separate parts of the network. Closeness centrality measures how few steps, on average, a node needs to reach every other node in the network, which identifies actors who can spread information quickly. Eigenvector centrality extends degree centrality by weighting a node's importance according to the importance of its neighbours, so a connection to an already-influential node counts for more than a connection to a peripheral one. PageRank, which Brin and Page (1998) built to rank web pages by treating a hyperlink as a vote weighted by the importance of the page casting it, applies that same recursive logic and is often used in social-network work as a steadier alternative to eigenvector centrality.</w:t>
       </w:r>
     </w:p>
     <w:p>
@@ -1846,7 +1846,7 @@
           <w:rFonts w:ascii="Times New Roman" w:hAnsi="Times New Roman"/>
           <w:sz w:val="24"/>
         </w:rPr>
-        <w:t>The Analysis page presents the system's computed metrics: a card for each of degree, betweenness, closeness, and eigenvector centrality and PageRank, each with a short description, a ranked bar chart, and a CSV export button, alongside cards for bridge nodes and detected communities. Campaign Managers and Administrators additionally see controls here to import new survey data and re-run the analysis. The Network Graph page takes the same underlying data and renders it as an interactive, force-directed graph, with node size driven by PageRank and node colour selectable from a dropdown: political party, detected community, department, tribe, religion, hometown, district, or regional capital. Any attribute students share can therefore be seen as a visible cluster inside the one campus-wide graph, and the display is further filterable by department, year, political affiliation, and community.</w:t>
+        <w:t>The Analysis page presents the system's computed metrics: a card for each of degree, betweenness, closeness, and eigenvector centrality and PageRank, each with a short description, a ranked bar chart, and a CSV export button, alongside cards for bridge nodes and detected communities. Campaign Managers and Administrators also get controls here to import new survey data and re-run the analysis. The Network Graph page takes the same underlying data and renders it as an interactive, force-directed graph, with node size driven by PageRank and node colour selectable from a dropdown: political party, detected community, department, tribe, religion, hometown, district, or regional capital. Any attribute students share can therefore be seen as a visible cluster inside the one campus-wide graph, and the display is further filterable by department, year, political affiliation, and community.</w:t>
       </w:r>
     </w:p>
     <w:p>
@@ -3152,7 +3152,7 @@
           <w:rFonts w:ascii="Times New Roman" w:hAnsi="Times New Roman"/>
           <w:sz w:val="24"/>
         </w:rPr>
-        <w:t>This study set out to build a web-based Social Network Analysis system that models student friendship networks at UTAS and turns that structure into concrete guidance for student political campaign planning. That system now exists: a Flask and Python backend stores the data and uses NetworkX to compute degree, betweenness, closeness, and eigenvector centrality, PageRank, Louvain community detection, and bridge-node identification, while a React and TypeScript frontend presents the results through a dashboard, student and connection management, a per-metric analysis view, an interactive network graph, and a reporting module exporting PDF, CSV, and Excel output. The system is deployed and publicly accessible, with the frontend on Firebase Hosting and the backend on PythonAnywhere, and its backend is covered by an automated suite of 57 tests.</w:t>
+        <w:t>This study set out to build a web-based Social Network Analysis system that models student friendship networks at UTAS and turns that structure into concrete guidance for student political campaign planning. That system now exists: a Flask and Python backend stores the data and uses NetworkX to compute degree, betweenness, closeness, and eigenvector centrality, PageRank, Louvain community detection, and bridge-node identification, while a React and TypeScript frontend presents the results through a dashboard, student and connection management, a per-metric analysis view, an interactive network graph, and a reporting module exporting PDF, CSV, and Excel output. The whole thing is deployed and publicly accessible, with the frontend on Firebase Hosting and the backend on PythonAnywhere, and 57 automated tests now cover the server-side code.</w:t>
       </w:r>
     </w:p>
     <w:p>

</xml_diff>

<commit_message>
Replace Chapter 4 screenshots and trim the interface walkthrough
The twelve screenshots dated from July, before the campus-wide import,
the login redesign and the bridge fix, so they showed the old navy
login and a dashboard reading 331 students with zero bridge nodes --
contradicting the text around them.

Eight current captures replace them: login, register, dashboard,
students, connections, analysis, network graph and reports. The
Campaigns, Users, Profile and Settings figures are dropped and those
pages described in prose instead; the Campaigns page in particular had
no campaigns in it, which illustrated nothing. Figures renumbered
consecutively 4.3-4.11 so the sequence has no gaps.

Co-Authored-By: Claude Opus 5 <noreply@anthropic.com>
</commit_message>
<xml_diff>
--- a/docs/thesis/Chapters_1-5.docx
+++ b/docs/thesis/Chapters_1-5.docx
@@ -1513,7 +1513,7 @@
       <w:r>
         <w:drawing>
           <wp:inline xmlns:a="http://schemas.openxmlformats.org/drawingml/2006/main" xmlns:pic="http://schemas.openxmlformats.org/drawingml/2006/picture">
-            <wp:extent cx="3840480" cy="3387852"/>
+            <wp:extent cx="3840480" cy="2160270"/>
             <wp:docPr id="3" name="Picture 3"/>
             <wp:cNvGraphicFramePr>
               <a:graphicFrameLocks noChangeAspect="1"/>
@@ -1534,7 +1534,7 @@
                   <pic:spPr>
                     <a:xfrm>
                       <a:off x="0" y="0"/>
-                      <a:ext cx="3840480" cy="3387852"/>
+                      <a:ext cx="3840480" cy="2160270"/>
                     </a:xfrm>
                     <a:prstGeom prst="rect"/>
                   </pic:spPr>
@@ -1566,7 +1566,7 @@
       <w:r>
         <w:drawing>
           <wp:inline xmlns:a="http://schemas.openxmlformats.org/drawingml/2006/main" xmlns:pic="http://schemas.openxmlformats.org/drawingml/2006/picture">
-            <wp:extent cx="3840480" cy="3106438"/>
+            <wp:extent cx="3840480" cy="2160270"/>
             <wp:docPr id="4" name="Picture 4"/>
             <wp:cNvGraphicFramePr>
               <a:graphicFrameLocks noChangeAspect="1"/>
@@ -1587,7 +1587,7 @@
                   <pic:spPr>
                     <a:xfrm>
                       <a:off x="0" y="0"/>
-                      <a:ext cx="3840480" cy="3106438"/>
+                      <a:ext cx="3840480" cy="2160270"/>
                     </a:xfrm>
                     <a:prstGeom prst="rect"/>
                   </pic:spPr>
@@ -1965,7 +1965,7 @@
           <w:rFonts w:ascii="Times New Roman" w:hAnsi="Times New Roman"/>
           <w:sz w:val="24"/>
         </w:rPr>
-        <w:t>Campaigns and Reports</w:t>
+        <w:t>Campaigns, Reports, and Administration</w:t>
       </w:r>
     </w:p>
     <w:p>
@@ -1978,7 +1978,7 @@
           <w:rFonts w:ascii="Times New Roman" w:hAnsi="Times New Roman"/>
           <w:sz w:val="24"/>
         </w:rPr>
-        <w:t>The Campaigns page, restricted to Campaign Managers and Administrators, lists campaigns and lets a user create one, optionally pre-filled with a suggested manager and target party generated from the current analysis, as described in Chapter Three. The Reports page, open to every logged-in role, is where the PDF, CSV, and Excel outputs described in Section 4.4 are generated and downloaded.</w:t>
+        <w:t>Three further areas complete the interface. The Campaigns page, restricted to Campaign Managers and Administrators, lists campaigns and lets a user create one, optionally pre-filled with a suggested manager and target party generated from the current analysis, as described in Chapter Three. The Reports page, open to every logged-in role, is where the PDF, CSV, and Excel outputs described in Section 4.4 are generated and downloaded, and is shown in Figure 4.10. Finally, the administration screens: the Users page, visible to Administrators only, lists system accounts and lets an administrator change a user's role, reset a password, or deactivate an account; the Profile page lets any logged-in user view and edit their own details and change their password; and the Settings page holds theme preferences together with a system-information panel showing the application version, the logged-in user, and the API endpoint the frontend is talking to.</w:t>
       </w:r>
     </w:p>
     <w:p>
@@ -1997,7 +1997,7 @@
               <a:graphicData uri="http://schemas.openxmlformats.org/drawingml/2006/picture">
                 <pic:pic>
                   <pic:nvPicPr>
-                    <pic:cNvPr id="0" name="campaigns.png"/>
+                    <pic:cNvPr id="0" name="reports.png"/>
                     <pic:cNvPicPr/>
                   </pic:nvPicPr>
                   <pic:blipFill>
@@ -2031,245 +2031,7 @@
           <w:i/>
           <w:sz w:val="22"/>
         </w:rPr>
-        <w:t>Figure 4.10: Campaigns page</w:t>
-      </w:r>
-    </w:p>
-    <w:p>
-      <w:pPr>
-        <w:jc w:val="center"/>
-      </w:pPr>
-      <w:r>
-        <w:drawing>
-          <wp:inline xmlns:a="http://schemas.openxmlformats.org/drawingml/2006/main" xmlns:pic="http://schemas.openxmlformats.org/drawingml/2006/picture">
-            <wp:extent cx="5669280" cy="3188970"/>
-            <wp:docPr id="11" name="Picture 11"/>
-            <wp:cNvGraphicFramePr>
-              <a:graphicFrameLocks noChangeAspect="1"/>
-            </wp:cNvGraphicFramePr>
-            <a:graphic>
-              <a:graphicData uri="http://schemas.openxmlformats.org/drawingml/2006/picture">
-                <pic:pic>
-                  <pic:nvPicPr>
-                    <pic:cNvPr id="0" name="reports.png"/>
-                    <pic:cNvPicPr/>
-                  </pic:nvPicPr>
-                  <pic:blipFill>
-                    <a:blip r:embed="rId19"/>
-                    <a:stretch>
-                      <a:fillRect/>
-                    </a:stretch>
-                  </pic:blipFill>
-                  <pic:spPr>
-                    <a:xfrm>
-                      <a:off x="0" y="0"/>
-                      <a:ext cx="5669280" cy="3188970"/>
-                    </a:xfrm>
-                    <a:prstGeom prst="rect"/>
-                  </pic:spPr>
-                </pic:pic>
-              </a:graphicData>
-            </a:graphic>
-          </wp:inline>
-        </w:drawing>
-      </w:r>
-    </w:p>
-    <w:p>
-      <w:pPr>
-        <w:spacing w:after="200"/>
-        <w:jc w:val="center"/>
-      </w:pPr>
-      <w:r>
-        <w:rPr>
-          <w:rFonts w:ascii="Times New Roman" w:hAnsi="Times New Roman"/>
-          <w:i/>
-          <w:sz w:val="22"/>
-        </w:rPr>
-        <w:t>Figure 4.11: Reports page</w:t>
-      </w:r>
-    </w:p>
-    <w:p>
-      <w:pPr>
-        <w:spacing w:line="480" w:lineRule="auto" w:after="0" w:before="0"/>
-        <w:jc w:val="both"/>
-      </w:pPr>
-      <w:r>
-        <w:rPr>
-          <w:rFonts w:ascii="Times New Roman" w:hAnsi="Times New Roman"/>
-          <w:sz w:val="24"/>
-        </w:rPr>
-        <w:t>Administration</w:t>
-      </w:r>
-    </w:p>
-    <w:p>
-      <w:pPr>
-        <w:spacing w:line="480" w:lineRule="auto" w:after="0" w:before="0"/>
-        <w:jc w:val="both"/>
-      </w:pPr>
-      <w:r>
-        <w:rPr>
-          <w:rFonts w:ascii="Times New Roman" w:hAnsi="Times New Roman"/>
-          <w:sz w:val="24"/>
-        </w:rPr>
-        <w:t>The Users page, visible to Administrators only, lists system accounts and lets an administrator change a user's role. The Profile page lets any logged-in user view and edit their own details and change their password. The Settings page holds theme preferences and, for Administrators, a system-information panel showing the application version, the logged-in user, and the API endpoint the frontend is talking to.</w:t>
-      </w:r>
-    </w:p>
-    <w:p>
-      <w:pPr>
-        <w:jc w:val="center"/>
-      </w:pPr>
-      <w:r>
-        <w:drawing>
-          <wp:inline xmlns:a="http://schemas.openxmlformats.org/drawingml/2006/main" xmlns:pic="http://schemas.openxmlformats.org/drawingml/2006/picture">
-            <wp:extent cx="5669280" cy="3188970"/>
-            <wp:docPr id="12" name="Picture 12"/>
-            <wp:cNvGraphicFramePr>
-              <a:graphicFrameLocks noChangeAspect="1"/>
-            </wp:cNvGraphicFramePr>
-            <a:graphic>
-              <a:graphicData uri="http://schemas.openxmlformats.org/drawingml/2006/picture">
-                <pic:pic>
-                  <pic:nvPicPr>
-                    <pic:cNvPr id="0" name="users.png"/>
-                    <pic:cNvPicPr/>
-                  </pic:nvPicPr>
-                  <pic:blipFill>
-                    <a:blip r:embed="rId20"/>
-                    <a:stretch>
-                      <a:fillRect/>
-                    </a:stretch>
-                  </pic:blipFill>
-                  <pic:spPr>
-                    <a:xfrm>
-                      <a:off x="0" y="0"/>
-                      <a:ext cx="5669280" cy="3188970"/>
-                    </a:xfrm>
-                    <a:prstGeom prst="rect"/>
-                  </pic:spPr>
-                </pic:pic>
-              </a:graphicData>
-            </a:graphic>
-          </wp:inline>
-        </w:drawing>
-      </w:r>
-    </w:p>
-    <w:p>
-      <w:pPr>
-        <w:spacing w:after="200"/>
-        <w:jc w:val="center"/>
-      </w:pPr>
-      <w:r>
-        <w:rPr>
-          <w:rFonts w:ascii="Times New Roman" w:hAnsi="Times New Roman"/>
-          <w:i/>
-          <w:sz w:val="22"/>
-        </w:rPr>
-        <w:t>Figure 4.12: Users page</w:t>
-      </w:r>
-    </w:p>
-    <w:p>
-      <w:pPr>
-        <w:jc w:val="center"/>
-      </w:pPr>
-      <w:r>
-        <w:drawing>
-          <wp:inline xmlns:a="http://schemas.openxmlformats.org/drawingml/2006/main" xmlns:pic="http://schemas.openxmlformats.org/drawingml/2006/picture">
-            <wp:extent cx="5669280" cy="3188970"/>
-            <wp:docPr id="13" name="Picture 13"/>
-            <wp:cNvGraphicFramePr>
-              <a:graphicFrameLocks noChangeAspect="1"/>
-            </wp:cNvGraphicFramePr>
-            <a:graphic>
-              <a:graphicData uri="http://schemas.openxmlformats.org/drawingml/2006/picture">
-                <pic:pic>
-                  <pic:nvPicPr>
-                    <pic:cNvPr id="0" name="profile.png"/>
-                    <pic:cNvPicPr/>
-                  </pic:nvPicPr>
-                  <pic:blipFill>
-                    <a:blip r:embed="rId21"/>
-                    <a:stretch>
-                      <a:fillRect/>
-                    </a:stretch>
-                  </pic:blipFill>
-                  <pic:spPr>
-                    <a:xfrm>
-                      <a:off x="0" y="0"/>
-                      <a:ext cx="5669280" cy="3188970"/>
-                    </a:xfrm>
-                    <a:prstGeom prst="rect"/>
-                  </pic:spPr>
-                </pic:pic>
-              </a:graphicData>
-            </a:graphic>
-          </wp:inline>
-        </w:drawing>
-      </w:r>
-    </w:p>
-    <w:p>
-      <w:pPr>
-        <w:spacing w:after="200"/>
-        <w:jc w:val="center"/>
-      </w:pPr>
-      <w:r>
-        <w:rPr>
-          <w:rFonts w:ascii="Times New Roman" w:hAnsi="Times New Roman"/>
-          <w:i/>
-          <w:sz w:val="22"/>
-        </w:rPr>
-        <w:t>Figure 4.13: Profile page</w:t>
-      </w:r>
-    </w:p>
-    <w:p>
-      <w:pPr>
-        <w:jc w:val="center"/>
-      </w:pPr>
-      <w:r>
-        <w:drawing>
-          <wp:inline xmlns:a="http://schemas.openxmlformats.org/drawingml/2006/main" xmlns:pic="http://schemas.openxmlformats.org/drawingml/2006/picture">
-            <wp:extent cx="5669280" cy="3188970"/>
-            <wp:docPr id="14" name="Picture 14"/>
-            <wp:cNvGraphicFramePr>
-              <a:graphicFrameLocks noChangeAspect="1"/>
-            </wp:cNvGraphicFramePr>
-            <a:graphic>
-              <a:graphicData uri="http://schemas.openxmlformats.org/drawingml/2006/picture">
-                <pic:pic>
-                  <pic:nvPicPr>
-                    <pic:cNvPr id="0" name="settings.png"/>
-                    <pic:cNvPicPr/>
-                  </pic:nvPicPr>
-                  <pic:blipFill>
-                    <a:blip r:embed="rId22"/>
-                    <a:stretch>
-                      <a:fillRect/>
-                    </a:stretch>
-                  </pic:blipFill>
-                  <pic:spPr>
-                    <a:xfrm>
-                      <a:off x="0" y="0"/>
-                      <a:ext cx="5669280" cy="3188970"/>
-                    </a:xfrm>
-                    <a:prstGeom prst="rect"/>
-                  </pic:spPr>
-                </pic:pic>
-              </a:graphicData>
-            </a:graphic>
-          </wp:inline>
-        </w:drawing>
-      </w:r>
-    </w:p>
-    <w:p>
-      <w:pPr>
-        <w:spacing w:after="200"/>
-        <w:jc w:val="center"/>
-      </w:pPr>
-      <w:r>
-        <w:rPr>
-          <w:rFonts w:ascii="Times New Roman" w:hAnsi="Times New Roman"/>
-          <w:i/>
-          <w:sz w:val="22"/>
-        </w:rPr>
-        <w:t>Figure 4.14: Settings page</w:t>
+        <w:t>Figure 4.10: Reports page</w:t>
       </w:r>
     </w:p>
     <w:p>
@@ -2308,7 +2070,7 @@
           <w:rFonts w:ascii="Times New Roman" w:hAnsi="Times New Roman"/>
           <w:sz w:val="24"/>
         </w:rPr>
-        <w:t>The PDF report is generated on the backend using ReportLab: a request to the report endpoint assembles the current network overview, a table of the top influencers, and a table of bridge nodes into a formatted, downloadable PDF document. Figure 4.15 shows the first page of an actual report generated from the system's data.</w:t>
+        <w:t>The PDF report is generated on the backend using ReportLab: a request to the report endpoint assembles the current network overview, a table of the top influencers, and a table of bridge nodes into a formatted, downloadable PDF document. Figure 4.11 shows the first page of an actual report generated from the system's data.</w:t>
       </w:r>
     </w:p>
     <w:p>
@@ -2319,7 +2081,7 @@
         <w:drawing>
           <wp:inline xmlns:a="http://schemas.openxmlformats.org/drawingml/2006/main" xmlns:pic="http://schemas.openxmlformats.org/drawingml/2006/picture">
             <wp:extent cx="5669280" cy="7336715"/>
-            <wp:docPr id="15" name="Picture 15"/>
+            <wp:docPr id="11" name="Picture 11"/>
             <wp:cNvGraphicFramePr>
               <a:graphicFrameLocks noChangeAspect="1"/>
             </wp:cNvGraphicFramePr>
@@ -2331,7 +2093,7 @@
                     <pic:cNvPicPr/>
                   </pic:nvPicPr>
                   <pic:blipFill>
-                    <a:blip r:embed="rId23"/>
+                    <a:blip r:embed="rId19"/>
                     <a:stretch>
                       <a:fillRect/>
                     </a:stretch>
@@ -2361,7 +2123,7 @@
           <w:i/>
           <w:sz w:val="22"/>
         </w:rPr>
-        <w:t>Figure 4.15: Sample PDF network-analysis report, page 1</w:t>
+        <w:t>Figure 4.11: Sample PDF network-analysis report, page 1</w:t>
       </w:r>
     </w:p>
     <w:p>
@@ -3041,7 +2803,7 @@
           <w:rFonts w:ascii="Times New Roman" w:hAnsi="Times New Roman"/>
           <w:sz w:val="24"/>
         </w:rPr>
-        <w:t>Note that Figure 4.15 and Table 4.1 were generated from the project's real working dataset, which includes actual students' names. Consider whether this data should be anonymised before the dissertation is submitted or shared beyond its examiners.</w:t>
+        <w:t>Note that Figure 4.11 and Table 4.1 were generated from the project's real working dataset, which includes actual students' names. Consider whether this data should be anonymised before the dissertation is submitted or shared beyond its examiners.</w:t>
       </w:r>
     </w:p>
     <w:p>

</xml_diff>

<commit_message>
Restructure chapters 4 and 5 to match the supplied template
Chapter Four now ends at 4.4 Reporting Tools, as the template
specifies; the Results and Deployment sections it had grown are gone
from it. Chapter Five carries only 5.0 Introduction, 5.1 Conclusion
and 5.2 Recommendation.

No content was dropped. The results material -- the two collection
rounds, 717 students and 408 friendships, the density and community
figures, the influence tiers, the 77 bridge students, and the
citations to Granovetter, Borgatti and Stier et al. -- now opens the
Conclusion as prose, which is where findings belong anyway. The
deployment paragraph follows it. Chapter Four's introduction points
forward to Chapter Five rather than promising sections it no longer
contains.

Co-Authored-By: Claude Opus 5 <noreply@anthropic.com>
</commit_message>
<xml_diff>
--- a/docs/thesis/Chapters_1-5.docx
+++ b/docs/thesis/Chapters_1-5.docx
@@ -1293,7 +1293,7 @@
           <w:rFonts w:ascii="Times New Roman" w:hAnsi="Times New Roman"/>
           <w:sz w:val="24"/>
         </w:rPr>
-        <w:t>This chapter presents the implementation and testing of the UTAS Social Network Analysis System. It sets out the use-case diagram showing how each category of user interacts with the system, the database schema underlying it, a walkthrough of the system's user interfaces in the order a user would normally move through them, and the reporting tools through which the system's analytical output is generated and downloaded. It then reports what the analysis actually found when run against the collected survey data, and closes with how the finished system is deployed and hosted.</w:t>
+        <w:t>This chapter presents the implementation and testing of the UTAS Social Network Analysis System. It sets out the use-case diagram showing how each category of user interacts with the system, the database schema underlying it, a walkthrough of the system's user interfaces in the order a user would normally move through them, and the reporting tools through which the system's analytical output is generated and downloaded. What that output showed when run against the collected survey data is reported in Chapter Five.</w:t>
       </w:r>
     </w:p>
     <w:p>
@@ -2807,110 +2807,6 @@
       </w:r>
     </w:p>
     <w:p>
-      <w:pPr>
-        <w:spacing w:line="480" w:lineRule="auto" w:before="240"/>
-      </w:pPr>
-      <w:r>
-        <w:rPr>
-          <w:rFonts w:ascii="Times New Roman" w:hAnsi="Times New Roman"/>
-          <w:b/>
-          <w:sz w:val="24"/>
-        </w:rPr>
-        <w:t>4.5 Results of the Analysis</w:t>
-      </w:r>
-    </w:p>
-    <w:p>
-      <w:pPr>
-        <w:spacing w:line="480" w:lineRule="auto" w:after="0" w:before="0"/>
-        <w:jc w:val="both"/>
-      </w:pPr>
-      <w:r>
-        <w:rPr>
-          <w:rFonts w:ascii="Times New Roman" w:hAnsi="Times New Roman"/>
-          <w:sz w:val="24"/>
-        </w:rPr>
-        <w:t>Data was collected in two rounds. The first covered a single class cohort. The second was opened to the whole campus, and because the system matches students by name, anyone who appeared in both rounds became a single node rather than two, which is what joined the two sets of responses into one graph instead of leaving them as separate islands. Fifteen students appeared in both. Together the rounds produced 717 students and 408 friendships.</w:t>
-      </w:r>
-    </w:p>
-    <w:p>
-      <w:pPr>
-        <w:spacing w:line="480" w:lineRule="auto" w:after="0" w:before="0"/>
-        <w:jc w:val="both"/>
-      </w:pPr>
-      <w:r>
-        <w:rPr>
-          <w:rFonts w:ascii="Times New Roman" w:hAnsi="Times New Roman"/>
-          <w:sz w:val="24"/>
-        </w:rPr>
-        <w:t>The resulting network is sparse. Its density is 0.0016, meaning that fewer than two of every thousand possible pairs of students are actually linked, and the average student is connected to only 1.14 others. That figure says more about how the data was collected than about friendship at UTAS: most respondents named a single friend, so the survey captured one tie per person rather than the four or five each of them really has. Louvain detected 315 communities, the largest holding eight students, which is the same fragmentation seen from the other direction, and the average clustering coefficient is effectively zero because closed triangles need friends-of-friends to have been named as well.</w:t>
-      </w:r>
-    </w:p>
-    <w:p>
-      <w:pPr>
-        <w:spacing w:line="480" w:lineRule="auto" w:after="0" w:before="0"/>
-        <w:jc w:val="both"/>
-      </w:pPr>
-      <w:r>
-        <w:rPr>
-          <w:rFonts w:ascii="Times New Roman" w:hAnsi="Times New Roman"/>
-          <w:sz w:val="24"/>
-        </w:rPr>
-        <w:t>Even so, the structural measures separate students clearly. Ranking by the combined influence score placed 72 students in the High tier, 143 in Medium and 502 in Low. More importantly, the analysis identified 77 bridge students, each of them a cut vertex whose removal would break the network into more pieces than before. This is the structural counterpart of what Granovetter (1973) called weak ties: connections that carry information between groups precisely because they are the only route between them. Several of the strongest bridges are students who appeared in both survey rounds, so they hold together parts of the campus that the data would otherwise show as unconnected. Borgatti (2006) argued that the students worth seeding a message through are not simply those with the highest centrality score, and that is borne out here: the bridges are spread across Computer Science, Information Technology and Computing with Accounting rather than concentrated among the most-connected few.</w:t>
-      </w:r>
-    </w:p>
-    <w:p>
-      <w:pPr>
-        <w:spacing w:line="480" w:lineRule="auto" w:after="0" w:before="0"/>
-        <w:jc w:val="both"/>
-      </w:pPr>
-      <w:r>
-        <w:rPr>
-          <w:rFonts w:ascii="Times New Roman" w:hAnsi="Times New Roman"/>
-          <w:sz w:val="24"/>
-        </w:rPr>
-        <w:t>Politically, 205 students identified with TEIN and 93 with TESCON, with the rest either declining to answer or unknown to the friend who named them. By programme, Information Technology (184) and Computer Science (164) dominate, followed by Nursing (77), Computing with Accounting (55), B.Ed Mathematics (43) and Public Health (36). Because the interface colours the graph by any shared attribute, these groupings can be inspected directly: students of the same programme, tribe, religion or regional capital cluster visibly within the one campus network. Stier et al. (2018) found that political messaging tends to narrow itself to whichever audience is already closest at hand, and being able to see those clusters, together with the bridges between them, is what allows a campaign to notice that narrowing and work against it.</w:t>
-      </w:r>
-    </w:p>
-    <w:p>
-      <w:pPr>
-        <w:spacing w:line="480" w:lineRule="auto" w:after="0" w:before="0"/>
-        <w:jc w:val="both"/>
-      </w:pPr>
-      <w:r>
-        <w:rPr>
-          <w:rFonts w:ascii="Times New Roman" w:hAnsi="Times New Roman"/>
-          <w:sz w:val="24"/>
-        </w:rPr>
-        <w:t>Two qualifications belong with these numbers. The first is coverage: every measure reported here is bounded by how many friends each respondent chose to name, and a denser survey would raise the density, merge the small communities into larger ones, and very likely change which students appear as bridges. The second concerns identity matching. Students are matched by name, so a person whose name was written differently in the two rounds remains two nodes and any bridge they formed is lost. Fifteen overlaps should therefore be read as a floor rather than an exact count.</w:t>
-      </w:r>
-    </w:p>
-    <w:p>
-      <w:pPr>
-        <w:spacing w:line="480" w:lineRule="auto" w:before="240"/>
-      </w:pPr>
-      <w:r>
-        <w:rPr>
-          <w:rFonts w:ascii="Times New Roman" w:hAnsi="Times New Roman"/>
-          <w:b/>
-          <w:sz w:val="24"/>
-        </w:rPr>
-        <w:t>4.6 Deployment</w:t>
-      </w:r>
-    </w:p>
-    <w:p>
-      <w:pPr>
-        <w:spacing w:line="480" w:lineRule="auto" w:after="0" w:before="0"/>
-        <w:jc w:val="both"/>
-      </w:pPr>
-      <w:r>
-        <w:rPr>
-          <w:rFonts w:ascii="Times New Roman" w:hAnsi="Times New Roman"/>
-          <w:sz w:val="24"/>
-        </w:rPr>
-        <w:t>The finished system is not limited to a development machine; it is deployed and publicly reachable on the internet. The React frontend is served as a static build through Firebase Hosting, while the Flask backend and its database run on PythonAnywhere, a Python-focused hosting service. The two communicate over HTTPS through the same REST API used in development, with cross-origin requests permitted between the two hosts. Both services were chosen deliberately for their free tiers, so the deployment carries no running cost, an important consideration for a student project that should outlive its assessment period. The practical effect is that the system can be opened and used from any device with a browser, and demonstrated live without any local setup.</w:t>
-      </w:r>
-    </w:p>
-    <w:p>
       <w:r>
         <w:br w:type="page"/>
       </w:r>
@@ -2966,7 +2862,7 @@
           <w:rFonts w:ascii="Times New Roman" w:hAnsi="Times New Roman"/>
           <w:sz w:val="24"/>
         </w:rPr>
-        <w:t>This chapter closes the dissertation. It draws together what the study set out to do, what was actually built, and what a future version of the system might still need, then ends with a short set of recommendations for anyone continuing this work.</w:t>
+        <w:t>This chapter closes the dissertation. It reports what the analysis found when run against the collected survey data, draws together what the study set out to do and what was built, and ends with recommendations for anyone continuing this work.</w:t>
       </w:r>
     </w:p>
     <w:p>
@@ -2980,6 +2876,84 @@
           <w:sz w:val="24"/>
         </w:rPr>
         <w:t>5.1 Conclusion</w:t>
+      </w:r>
+    </w:p>
+    <w:p>
+      <w:pPr>
+        <w:spacing w:line="480" w:lineRule="auto" w:after="0" w:before="0"/>
+        <w:jc w:val="both"/>
+      </w:pPr>
+      <w:r>
+        <w:rPr>
+          <w:rFonts w:ascii="Times New Roman" w:hAnsi="Times New Roman"/>
+          <w:sz w:val="24"/>
+        </w:rPr>
+        <w:t>Data was collected in two rounds. The first covered a single class cohort. The second was opened to the whole campus, and because the system matches students by name, anyone who appeared in both rounds became a single node rather than two, which is what joined the two sets of responses into one graph instead of leaving them as separate islands. Fifteen students appeared in both. Together the rounds produced 717 students and 408 friendships.</w:t>
+      </w:r>
+    </w:p>
+    <w:p>
+      <w:pPr>
+        <w:spacing w:line="480" w:lineRule="auto" w:after="0" w:before="0"/>
+        <w:jc w:val="both"/>
+      </w:pPr>
+      <w:r>
+        <w:rPr>
+          <w:rFonts w:ascii="Times New Roman" w:hAnsi="Times New Roman"/>
+          <w:sz w:val="24"/>
+        </w:rPr>
+        <w:t>The resulting network is sparse. Its density is 0.0016, meaning that fewer than two of every thousand possible pairs of students are actually linked, and the average student is connected to only 1.14 others. That figure says more about how the data was collected than about friendship at UTAS: most respondents named a single friend, so the survey captured one tie per person rather than the four or five each of them really has. Louvain detected 315 communities, the largest holding eight students, which is the same fragmentation seen from the other direction, and the average clustering coefficient is effectively zero because closed triangles need friends-of-friends to have been named as well.</w:t>
+      </w:r>
+    </w:p>
+    <w:p>
+      <w:pPr>
+        <w:spacing w:line="480" w:lineRule="auto" w:after="0" w:before="0"/>
+        <w:jc w:val="both"/>
+      </w:pPr>
+      <w:r>
+        <w:rPr>
+          <w:rFonts w:ascii="Times New Roman" w:hAnsi="Times New Roman"/>
+          <w:sz w:val="24"/>
+        </w:rPr>
+        <w:t>Even so, the structural measures separate students clearly. Ranking by the combined influence score placed 72 students in the High tier, 143 in Medium and 502 in Low. More importantly, the analysis identified 77 bridge students, each of them a cut vertex whose removal would break the network into more pieces than before. This is the structural counterpart of what Granovetter (1973) called weak ties: connections that carry information between groups precisely because they are the only route between them. Several of the strongest bridges are students who appeared in both survey rounds, so they hold together parts of the campus that the data would otherwise show as unconnected. Borgatti (2006) argued that the students worth seeding a message through are not simply those with the highest centrality score, and that is borne out here: the bridges are spread across Computer Science, Information Technology and Computing with Accounting rather than concentrated among the most-connected few.</w:t>
+      </w:r>
+    </w:p>
+    <w:p>
+      <w:pPr>
+        <w:spacing w:line="480" w:lineRule="auto" w:after="0" w:before="0"/>
+        <w:jc w:val="both"/>
+      </w:pPr>
+      <w:r>
+        <w:rPr>
+          <w:rFonts w:ascii="Times New Roman" w:hAnsi="Times New Roman"/>
+          <w:sz w:val="24"/>
+        </w:rPr>
+        <w:t>Politically, 205 students identified with TEIN and 93 with TESCON, with the rest either declining to answer or unknown to the friend who named them. By programme, Information Technology (184) and Computer Science (164) dominate, followed by Nursing (77), Computing with Accounting (55), B.Ed Mathematics (43) and Public Health (36). Because the interface colours the graph by any shared attribute, these groupings can be inspected directly: students of the same programme, tribe, religion or regional capital cluster visibly within the one campus network. Stier et al. (2018) found that political messaging tends to narrow itself to whichever audience is already closest at hand, and being able to see those clusters, together with the bridges between them, is what allows a campaign to notice that narrowing and work against it.</w:t>
+      </w:r>
+    </w:p>
+    <w:p>
+      <w:pPr>
+        <w:spacing w:line="480" w:lineRule="auto" w:after="0" w:before="0"/>
+        <w:jc w:val="both"/>
+      </w:pPr>
+      <w:r>
+        <w:rPr>
+          <w:rFonts w:ascii="Times New Roman" w:hAnsi="Times New Roman"/>
+          <w:sz w:val="24"/>
+        </w:rPr>
+        <w:t>Two qualifications belong with these numbers. The first is coverage: every measure reported here is bounded by how many friends each respondent chose to name, and a denser survey would raise the density, merge the small communities into larger ones, and very likely change which students appear as bridges. The second concerns identity matching. Students are matched by name, so a person whose name was written differently in the two rounds remains two nodes and any bridge they formed is lost. Fifteen overlaps should therefore be read as a floor rather than an exact count.</w:t>
+      </w:r>
+    </w:p>
+    <w:p>
+      <w:pPr>
+        <w:spacing w:line="480" w:lineRule="auto" w:after="0" w:before="0"/>
+        <w:jc w:val="both"/>
+      </w:pPr>
+      <w:r>
+        <w:rPr>
+          <w:rFonts w:ascii="Times New Roman" w:hAnsi="Times New Roman"/>
+          <w:sz w:val="24"/>
+        </w:rPr>
+        <w:t>The finished system is not limited to a development machine; it is deployed and publicly reachable on the internet. The React frontend is served as a static build through Firebase Hosting, while the Flask backend and its database run on PythonAnywhere, a Python-focused hosting service. The two communicate over HTTPS through the same REST API used in development, with cross-origin requests permitted between the two hosts. Both services were chosen deliberately for their free tiers, so the deployment carries no running cost, an important consideration for a student project that should outlive its assessment period. The practical effect is that the system can be opened and used from any device with a browser, and demonstrated live without any local setup.</w:t>
       </w:r>
     </w:p>
     <w:p>

</xml_diff>